<commit_message>
Clarify Lathi image request: 22 files in two batches.
</commit_message>
<xml_diff>
--- a/docs/engineering-report/Images_Needed_for_Documentation.docx
+++ b/docs/engineering-report/Images_Needed_for_Documentation.docx
@@ -7,7 +7,7 @@
         <w:pStyle w:val="Title"/>
       </w:pPr>
       <w:r>
-        <w:t>Images needed for the documentation</w:t>
+        <w:t>Images needed from Aayush (Lathi)</w:t>
       </w:r>
     </w:p>
     <w:p>
@@ -15,27 +15,22 @@
         <w:rPr>
           <w:i/>
         </w:rPr>
-        <w:t>Portfolio GraphRAG Chatbot — Industry Project</w:t>
+        <w:t>Portfolio GraphRAG Chatbot — SEDD (22 figures)</w:t>
       </w:r>
     </w:p>
     <w:p>
       <w:r>
-        <w:t>Upload to: Overleaf → images/ folder</w:t>
+        <w:t>Repo: https://github.com/AtharvGore14/graphrag-portfolio-chatbot</w:t>
       </w:r>
     </w:p>
     <w:p>
       <w:r>
-        <w:t>Project: https://www.overleaf.com/1656157384wxcgqvgpkpdx#c9a2af</w:t>
+        <w:t>LaTeX path: docs/engineering-report/latex/images/  |  Overleaf: https://www.overleaf.com/1656157384wxcgqvgpkpdx#c9a2af</w:t>
       </w:r>
     </w:p>
     <w:p>
       <w:r>
-        <w:t>Use these exact filenames (PNG preferred). Please avoid showing real API keys or passwords.</w:t>
-      </w:r>
-    </w:p>
-    <w:p>
-      <w:r>
-        <w:t>After chapter consolidation the report needs 22 figures total (10 screenshots + 12 diagrams). Anything not listed below was cut — do not draw or capture it.</w:t>
+        <w:t>Exact PNG filenames. No API keys/passwords. Logo already done — skip 01_college_logo.png.</w:t>
       </w:r>
     </w:p>
     <w:p>
@@ -43,7 +38,7 @@
         <w:pStyle w:val="Heading1"/>
       </w:pPr>
       <w:r>
-        <w:t>Already done (skip)</w:t>
+        <w:t>Batch 1 — Screenshots (10)</w:t>
       </w:r>
     </w:p>
     <w:tbl>
@@ -63,7 +58,7 @@
           </w:tcPr>
           <w:p>
             <w:r>
-              <w:t>Filename</w:t>
+              <w:t>Exact filename</w:t>
             </w:r>
           </w:p>
         </w:tc>
@@ -73,7 +68,7 @@
           </w:tcPr>
           <w:p>
             <w:r>
-              <w:t>Notes</w:t>
+              <w:t>What to capture</w:t>
             </w:r>
           </w:p>
         </w:tc>
@@ -85,7 +80,7 @@
           </w:tcPr>
           <w:p>
             <w:r>
-              <w:t>01_college_logo.png</w:t>
+              <w:t>S01_compose_healthy.png</w:t>
             </w:r>
           </w:p>
         </w:tc>
@@ -95,7 +90,205 @@
           </w:tcPr>
           <w:p>
             <w:r>
-              <w:t>Already in latex/images/</w:t>
+              <w:t>Compose healthy (docker compose ps)</w:t>
+            </w:r>
+          </w:p>
+        </w:tc>
+      </w:tr>
+      <w:tr>
+        <w:tc>
+          <w:tcPr>
+            <w:tcW w:type="dxa" w:w="4320"/>
+          </w:tcPr>
+          <w:p>
+            <w:r>
+              <w:t>S02_health_json.png</w:t>
+            </w:r>
+          </w:p>
+        </w:tc>
+        <w:tc>
+          <w:tcPr>
+            <w:tcW w:type="dxa" w:w="4320"/>
+          </w:tcPr>
+          <w:p>
+            <w:r>
+              <w:t>http://localhost:8000/health</w:t>
+            </w:r>
+          </w:p>
+        </w:tc>
+      </w:tr>
+      <w:tr>
+        <w:tc>
+          <w:tcPr>
+            <w:tcW w:type="dxa" w:w="4320"/>
+          </w:tcPr>
+          <w:p>
+            <w:r>
+              <w:t>S03_swagger_docs.png</w:t>
+            </w:r>
+          </w:p>
+        </w:tc>
+        <w:tc>
+          <w:tcPr>
+            <w:tcW w:type="dxa" w:w="4320"/>
+          </w:tcPr>
+          <w:p>
+            <w:r>
+              <w:t>http://localhost:8000/docs</w:t>
+            </w:r>
+          </w:p>
+        </w:tc>
+      </w:tr>
+      <w:tr>
+        <w:tc>
+          <w:tcPr>
+            <w:tcW w:type="dxa" w:w="4320"/>
+          </w:tcPr>
+          <w:p>
+            <w:r>
+              <w:t>S05_ui_grounded_answer.png</w:t>
+            </w:r>
+          </w:p>
+        </w:tc>
+        <w:tc>
+          <w:tcPr>
+            <w:tcW w:type="dxa" w:w="4320"/>
+          </w:tcPr>
+          <w:p>
+            <w:r>
+              <w:t>UI demo + ADANIPOWER holdings + citations</w:t>
+            </w:r>
+          </w:p>
+        </w:tc>
+      </w:tr>
+      <w:tr>
+        <w:tc>
+          <w:tcPr>
+            <w:tcW w:type="dxa" w:w="4320"/>
+          </w:tcPr>
+          <w:p>
+            <w:r>
+              <w:t>S06_ui_refuse.png</w:t>
+            </w:r>
+          </w:p>
+        </w:tc>
+        <w:tc>
+          <w:tcPr>
+            <w:tcW w:type="dxa" w:w="4320"/>
+          </w:tcPr>
+          <w:p>
+            <w:r>
+              <w:t>UI unknown ticker → refuse</w:t>
+            </w:r>
+          </w:p>
+        </w:tc>
+      </w:tr>
+      <w:tr>
+        <w:tc>
+          <w:tcPr>
+            <w:tcW w:type="dxa" w:w="4320"/>
+          </w:tcPr>
+          <w:p>
+            <w:r>
+              <w:t>S08_neo4j_subgraph.png</w:t>
+            </w:r>
+          </w:p>
+        </w:tc>
+        <w:tc>
+          <w:tcPr>
+            <w:tcW w:type="dxa" w:w="4320"/>
+          </w:tcPr>
+          <w:p>
+            <w:r>
+              <w:t>Neo4j Browser demo subgraph</w:t>
+            </w:r>
+          </w:p>
+        </w:tc>
+      </w:tr>
+      <w:tr>
+        <w:tc>
+          <w:tcPr>
+            <w:tcW w:type="dxa" w:w="4320"/>
+          </w:tcPr>
+          <w:p>
+            <w:r>
+              <w:t>S09_ingest_cli.png</w:t>
+            </w:r>
+          </w:p>
+        </w:tc>
+        <w:tc>
+          <w:tcPr>
+            <w:tcW w:type="dxa" w:w="4320"/>
+          </w:tcPr>
+          <w:p>
+            <w:r>
+              <w:t>ingest_portfolio.py --all success</w:t>
+            </w:r>
+          </w:p>
+        </w:tc>
+      </w:tr>
+      <w:tr>
+        <w:tc>
+          <w:tcPr>
+            <w:tcW w:type="dxa" w:w="4320"/>
+          </w:tcPr>
+          <w:p>
+            <w:r>
+              <w:t>S10_pytest.png</w:t>
+            </w:r>
+          </w:p>
+        </w:tc>
+        <w:tc>
+          <w:tcPr>
+            <w:tcW w:type="dxa" w:w="4320"/>
+          </w:tcPr>
+          <w:p>
+            <w:r>
+              <w:t>pytest /tests -q</w:t>
+            </w:r>
+          </w:p>
+        </w:tc>
+      </w:tr>
+      <w:tr>
+        <w:tc>
+          <w:tcPr>
+            <w:tcW w:type="dxa" w:w="4320"/>
+          </w:tcPr>
+          <w:p>
+            <w:r>
+              <w:t>S11_verify_scripts.png</w:t>
+            </w:r>
+          </w:p>
+        </w:tc>
+        <w:tc>
+          <w:tcPr>
+            <w:tcW w:type="dxa" w:w="4320"/>
+          </w:tcPr>
+          <w:p>
+            <w:r>
+              <w:t>verify_chat / verify_questions success</w:t>
+            </w:r>
+          </w:p>
+        </w:tc>
+      </w:tr>
+      <w:tr>
+        <w:tc>
+          <w:tcPr>
+            <w:tcW w:type="dxa" w:w="4320"/>
+          </w:tcPr>
+          <w:p>
+            <w:r>
+              <w:t>S13_env_example_redacted.png</w:t>
+            </w:r>
+          </w:p>
+        </w:tc>
+        <w:tc>
+          <w:tcPr>
+            <w:tcW w:type="dxa" w:w="4320"/>
+          </w:tcPr>
+          <w:p>
+            <w:r>
+              <w:t>.env.example with secrets blurred</w:t>
             </w:r>
           </w:p>
         </w:tc>
@@ -106,7 +299,7 @@
         <w:pStyle w:val="Heading1"/>
       </w:pPr>
       <w:r>
-        <w:t>A) Screenshots — after running the project (10 required)</w:t>
+        <w:t>Batch 2 — Diagrams (12)</w:t>
       </w:r>
     </w:p>
     <w:tbl>
@@ -116,26 +309,13 @@
         <w:tblLook w:firstColumn="1" w:firstRow="1" w:lastColumn="0" w:lastRow="0" w:noHBand="0" w:noVBand="1" w:val="04A0"/>
       </w:tblPr>
       <w:tblGrid>
-        <w:gridCol w:w="1728"/>
-        <w:gridCol w:w="1728"/>
-        <w:gridCol w:w="1728"/>
-        <w:gridCol w:w="1728"/>
-        <w:gridCol w:w="1728"/>
+        <w:gridCol w:w="4320"/>
+        <w:gridCol w:w="4320"/>
       </w:tblGrid>
       <w:tr>
         <w:tc>
           <w:tcPr>
-            <w:tcW w:type="dxa" w:w="1728"/>
-          </w:tcPr>
-          <w:p>
-            <w:r>
-              <w:t>#</w:t>
-            </w:r>
-          </w:p>
-        </w:tc>
-        <w:tc>
-          <w:tcPr>
-            <w:tcW w:type="dxa" w:w="1728"/>
+            <w:tcW w:type="dxa" w:w="4320"/>
           </w:tcPr>
           <w:p>
             <w:r>
@@ -145,31 +325,11 @@
         </w:tc>
         <w:tc>
           <w:tcPr>
-            <w:tcW w:type="dxa" w:w="1728"/>
+            <w:tcW w:type="dxa" w:w="4320"/>
           </w:tcPr>
           <w:p>
             <w:r>
-              <w:t>What to capture</w:t>
-            </w:r>
-          </w:p>
-        </w:tc>
-        <w:tc>
-          <w:tcPr>
-            <w:tcW w:type="dxa" w:w="1728"/>
-          </w:tcPr>
-          <w:p>
-            <w:r>
-              <w:t>How</w:t>
-            </w:r>
-          </w:p>
-        </w:tc>
-        <w:tc>
-          <w:tcPr>
-            <w:tcW w:type="dxa" w:w="1728"/>
-          </w:tcPr>
-          <w:p>
-            <w:r>
-              <w:t>Used in</w:t>
+              <w:t>What to show</w:t>
             </w:r>
           </w:p>
         </w:tc>
@@ -177,584 +337,7 @@
       <w:tr>
         <w:tc>
           <w:tcPr>
-            <w:tcW w:type="dxa" w:w="1728"/>
-          </w:tcPr>
-          <w:p>
-            <w:r>
-              <w:t>1</w:t>
-            </w:r>
-          </w:p>
-        </w:tc>
-        <w:tc>
-          <w:tcPr>
-            <w:tcW w:type="dxa" w:w="1728"/>
-          </w:tcPr>
-          <w:p>
-            <w:r>
-              <w:t>S01_compose_healthy.png</w:t>
-            </w:r>
-          </w:p>
-        </w:tc>
-        <w:tc>
-          <w:tcPr>
-            <w:tcW w:type="dxa" w:w="1728"/>
-          </w:tcPr>
-          <w:p>
-            <w:r>
-              <w:t>Compose stack healthy</w:t>
-            </w:r>
-          </w:p>
-        </w:tc>
-        <w:tc>
-          <w:tcPr>
-            <w:tcW w:type="dxa" w:w="1728"/>
-          </w:tcPr>
-          <w:p>
-            <w:r>
-              <w:t>docker compose up --build then Desktop / docker compose ps</w:t>
-            </w:r>
-          </w:p>
-        </w:tc>
-        <w:tc>
-          <w:tcPr>
-            <w:tcW w:type="dxa" w:w="1728"/>
-          </w:tcPr>
-          <w:p>
-            <w:r>
-              <w:t>Ch 4</w:t>
-            </w:r>
-          </w:p>
-        </w:tc>
-      </w:tr>
-      <w:tr>
-        <w:tc>
-          <w:tcPr>
-            <w:tcW w:type="dxa" w:w="1728"/>
-          </w:tcPr>
-          <w:p>
-            <w:r>
-              <w:t>2</w:t>
-            </w:r>
-          </w:p>
-        </w:tc>
-        <w:tc>
-          <w:tcPr>
-            <w:tcW w:type="dxa" w:w="1728"/>
-          </w:tcPr>
-          <w:p>
-            <w:r>
-              <w:t>S02_health_json.png</w:t>
-            </w:r>
-          </w:p>
-        </w:tc>
-        <w:tc>
-          <w:tcPr>
-            <w:tcW w:type="dxa" w:w="1728"/>
-          </w:tcPr>
-          <w:p>
-            <w:r>
-              <w:t>Health JSON</w:t>
-            </w:r>
-          </w:p>
-        </w:tc>
-        <w:tc>
-          <w:tcPr>
-            <w:tcW w:type="dxa" w:w="1728"/>
-          </w:tcPr>
-          <w:p>
-            <w:r>
-              <w:t>Open http://localhost:8000/health</w:t>
-            </w:r>
-          </w:p>
-        </w:tc>
-        <w:tc>
-          <w:tcPr>
-            <w:tcW w:type="dxa" w:w="1728"/>
-          </w:tcPr>
-          <w:p>
-            <w:r>
-              <w:t>Ch 4</w:t>
-            </w:r>
-          </w:p>
-        </w:tc>
-      </w:tr>
-      <w:tr>
-        <w:tc>
-          <w:tcPr>
-            <w:tcW w:type="dxa" w:w="1728"/>
-          </w:tcPr>
-          <w:p>
-            <w:r>
-              <w:t>3</w:t>
-            </w:r>
-          </w:p>
-        </w:tc>
-        <w:tc>
-          <w:tcPr>
-            <w:tcW w:type="dxa" w:w="1728"/>
-          </w:tcPr>
-          <w:p>
-            <w:r>
-              <w:t>S03_swagger_docs.png</w:t>
-            </w:r>
-          </w:p>
-        </w:tc>
-        <w:tc>
-          <w:tcPr>
-            <w:tcW w:type="dxa" w:w="1728"/>
-          </w:tcPr>
-          <w:p>
-            <w:r>
-              <w:t>Swagger UI</w:t>
-            </w:r>
-          </w:p>
-        </w:tc>
-        <w:tc>
-          <w:tcPr>
-            <w:tcW w:type="dxa" w:w="1728"/>
-          </w:tcPr>
-          <w:p>
-            <w:r>
-              <w:t>Open http://localhost:8000/docs</w:t>
-            </w:r>
-          </w:p>
-        </w:tc>
-        <w:tc>
-          <w:tcPr>
-            <w:tcW w:type="dxa" w:w="1728"/>
-          </w:tcPr>
-          <w:p>
-            <w:r>
-              <w:t>Ch 6</w:t>
-            </w:r>
-          </w:p>
-        </w:tc>
-      </w:tr>
-      <w:tr>
-        <w:tc>
-          <w:tcPr>
-            <w:tcW w:type="dxa" w:w="1728"/>
-          </w:tcPr>
-          <w:p>
-            <w:r>
-              <w:t>4</w:t>
-            </w:r>
-          </w:p>
-        </w:tc>
-        <w:tc>
-          <w:tcPr>
-            <w:tcW w:type="dxa" w:w="1728"/>
-          </w:tcPr>
-          <w:p>
-            <w:r>
-              <w:t>S05_ui_grounded_answer.png</w:t>
-            </w:r>
-          </w:p>
-        </w:tc>
-        <w:tc>
-          <w:tcPr>
-            <w:tcW w:type="dxa" w:w="1728"/>
-          </w:tcPr>
-          <w:p>
-            <w:r>
-              <w:t>Grounded answer + citations</w:t>
-            </w:r>
-          </w:p>
-        </w:tc>
-        <w:tc>
-          <w:tcPr>
-            <w:tcW w:type="dxa" w:w="1728"/>
-          </w:tcPr>
-          <w:p>
-            <w:r>
-              <w:t>user_id=demo, ask e.g. ADANIPOWER holdings</w:t>
-            </w:r>
-          </w:p>
-        </w:tc>
-        <w:tc>
-          <w:tcPr>
-            <w:tcW w:type="dxa" w:w="1728"/>
-          </w:tcPr>
-          <w:p>
-            <w:r>
-              <w:t>Ch 7</w:t>
-            </w:r>
-          </w:p>
-        </w:tc>
-      </w:tr>
-      <w:tr>
-        <w:tc>
-          <w:tcPr>
-            <w:tcW w:type="dxa" w:w="1728"/>
-          </w:tcPr>
-          <w:p>
-            <w:r>
-              <w:t>5</w:t>
-            </w:r>
-          </w:p>
-        </w:tc>
-        <w:tc>
-          <w:tcPr>
-            <w:tcW w:type="dxa" w:w="1728"/>
-          </w:tcPr>
-          <w:p>
-            <w:r>
-              <w:t>S06_ui_refuse.png</w:t>
-            </w:r>
-          </w:p>
-        </w:tc>
-        <w:tc>
-          <w:tcPr>
-            <w:tcW w:type="dxa" w:w="1728"/>
-          </w:tcPr>
-          <w:p>
-            <w:r>
-              <w:t>Refuse / clarify</w:t>
-            </w:r>
-          </w:p>
-        </w:tc>
-        <w:tc>
-          <w:tcPr>
-            <w:tcW w:type="dxa" w:w="1728"/>
-          </w:tcPr>
-          <w:p>
-            <w:r>
-              <w:t>Ask unknown ticker / missing fact</w:t>
-            </w:r>
-          </w:p>
-        </w:tc>
-        <w:tc>
-          <w:tcPr>
-            <w:tcW w:type="dxa" w:w="1728"/>
-          </w:tcPr>
-          <w:p>
-            <w:r>
-              <w:t>Ch 7</w:t>
-            </w:r>
-          </w:p>
-        </w:tc>
-      </w:tr>
-      <w:tr>
-        <w:tc>
-          <w:tcPr>
-            <w:tcW w:type="dxa" w:w="1728"/>
-          </w:tcPr>
-          <w:p>
-            <w:r>
-              <w:t>6</w:t>
-            </w:r>
-          </w:p>
-        </w:tc>
-        <w:tc>
-          <w:tcPr>
-            <w:tcW w:type="dxa" w:w="1728"/>
-          </w:tcPr>
-          <w:p>
-            <w:r>
-              <w:t>S08_neo4j_subgraph.png</w:t>
-            </w:r>
-          </w:p>
-        </w:tc>
-        <w:tc>
-          <w:tcPr>
-            <w:tcW w:type="dxa" w:w="1728"/>
-          </w:tcPr>
-          <w:p>
-            <w:r>
-              <w:t>Neo4j Browser subgraph</w:t>
-            </w:r>
-          </w:p>
-        </w:tc>
-        <w:tc>
-          <w:tcPr>
-            <w:tcW w:type="dxa" w:w="1728"/>
-          </w:tcPr>
-          <w:p>
-            <w:r>
-              <w:t>http://localhost:7474, match user demo</w:t>
-            </w:r>
-          </w:p>
-        </w:tc>
-        <w:tc>
-          <w:tcPr>
-            <w:tcW w:type="dxa" w:w="1728"/>
-          </w:tcPr>
-          <w:p>
-            <w:r>
-              <w:t>Ch 9</w:t>
-            </w:r>
-          </w:p>
-        </w:tc>
-      </w:tr>
-      <w:tr>
-        <w:tc>
-          <w:tcPr>
-            <w:tcW w:type="dxa" w:w="1728"/>
-          </w:tcPr>
-          <w:p>
-            <w:r>
-              <w:t>7</w:t>
-            </w:r>
-          </w:p>
-        </w:tc>
-        <w:tc>
-          <w:tcPr>
-            <w:tcW w:type="dxa" w:w="1728"/>
-          </w:tcPr>
-          <w:p>
-            <w:r>
-              <w:t>S09_ingest_cli.png</w:t>
-            </w:r>
-          </w:p>
-        </w:tc>
-        <w:tc>
-          <w:tcPr>
-            <w:tcW w:type="dxa" w:w="1728"/>
-          </w:tcPr>
-          <w:p>
-            <w:r>
-              <w:t>Ingest success</w:t>
-            </w:r>
-          </w:p>
-        </w:tc>
-        <w:tc>
-          <w:tcPr>
-            <w:tcW w:type="dxa" w:w="1728"/>
-          </w:tcPr>
-          <w:p>
-            <w:r>
-              <w:t>docker compose exec api python /scripts/ingest_portfolio.py --all</w:t>
-            </w:r>
-          </w:p>
-        </w:tc>
-        <w:tc>
-          <w:tcPr>
-            <w:tcW w:type="dxa" w:w="1728"/>
-          </w:tcPr>
-          <w:p>
-            <w:r>
-              <w:t>Ch 9</w:t>
-            </w:r>
-          </w:p>
-        </w:tc>
-      </w:tr>
-      <w:tr>
-        <w:tc>
-          <w:tcPr>
-            <w:tcW w:type="dxa" w:w="1728"/>
-          </w:tcPr>
-          <w:p>
-            <w:r>
-              <w:t>8</w:t>
-            </w:r>
-          </w:p>
-        </w:tc>
-        <w:tc>
-          <w:tcPr>
-            <w:tcW w:type="dxa" w:w="1728"/>
-          </w:tcPr>
-          <w:p>
-            <w:r>
-              <w:t>S10_pytest.png</w:t>
-            </w:r>
-          </w:p>
-        </w:tc>
-        <w:tc>
-          <w:tcPr>
-            <w:tcW w:type="dxa" w:w="1728"/>
-          </w:tcPr>
-          <w:p>
-            <w:r>
-              <w:t>Unit tests pass summary</w:t>
-            </w:r>
-          </w:p>
-        </w:tc>
-        <w:tc>
-          <w:tcPr>
-            <w:tcW w:type="dxa" w:w="1728"/>
-          </w:tcPr>
-          <w:p>
-            <w:r>
-              <w:t>docker compose exec api pytest /tests -q</w:t>
-            </w:r>
-          </w:p>
-        </w:tc>
-        <w:tc>
-          <w:tcPr>
-            <w:tcW w:type="dxa" w:w="1728"/>
-          </w:tcPr>
-          <w:p>
-            <w:r>
-              <w:t>Ch 8</w:t>
-            </w:r>
-          </w:p>
-        </w:tc>
-      </w:tr>
-      <w:tr>
-        <w:tc>
-          <w:tcPr>
-            <w:tcW w:type="dxa" w:w="1728"/>
-          </w:tcPr>
-          <w:p>
-            <w:r>
-              <w:t>9</w:t>
-            </w:r>
-          </w:p>
-        </w:tc>
-        <w:tc>
-          <w:tcPr>
-            <w:tcW w:type="dxa" w:w="1728"/>
-          </w:tcPr>
-          <w:p>
-            <w:r>
-              <w:t>S11_verify_scripts.png</w:t>
-            </w:r>
-          </w:p>
-        </w:tc>
-        <w:tc>
-          <w:tcPr>
-            <w:tcW w:type="dxa" w:w="1728"/>
-          </w:tcPr>
-          <w:p>
-            <w:r>
-              <w:t>Verify script success</w:t>
-            </w:r>
-          </w:p>
-        </w:tc>
-        <w:tc>
-          <w:tcPr>
-            <w:tcW w:type="dxa" w:w="1728"/>
-          </w:tcPr>
-          <w:p>
-            <w:r>
-              <w:t>e.g. verify_chat.py / verify_questions.py</w:t>
-            </w:r>
-          </w:p>
-        </w:tc>
-        <w:tc>
-          <w:tcPr>
-            <w:tcW w:type="dxa" w:w="1728"/>
-          </w:tcPr>
-          <w:p>
-            <w:r>
-              <w:t>Ch 8</w:t>
-            </w:r>
-          </w:p>
-        </w:tc>
-      </w:tr>
-      <w:tr>
-        <w:tc>
-          <w:tcPr>
-            <w:tcW w:type="dxa" w:w="1728"/>
-          </w:tcPr>
-          <w:p>
-            <w:r>
-              <w:t>10</w:t>
-            </w:r>
-          </w:p>
-        </w:tc>
-        <w:tc>
-          <w:tcPr>
-            <w:tcW w:type="dxa" w:w="1728"/>
-          </w:tcPr>
-          <w:p>
-            <w:r>
-              <w:t>S13_env_example_redacted.png</w:t>
-            </w:r>
-          </w:p>
-        </w:tc>
-        <w:tc>
-          <w:tcPr>
-            <w:tcW w:type="dxa" w:w="1728"/>
-          </w:tcPr>
-          <w:p>
-            <w:r>
-              <w:t>Env template</w:t>
-            </w:r>
-          </w:p>
-        </w:tc>
-        <w:tc>
-          <w:tcPr>
-            <w:tcW w:type="dxa" w:w="1728"/>
-          </w:tcPr>
-          <w:p>
-            <w:r>
-              <w:t>Screenshot .env.example with keys blurred/redacted</w:t>
-            </w:r>
-          </w:p>
-        </w:tc>
-        <w:tc>
-          <w:tcPr>
-            <w:tcW w:type="dxa" w:w="1728"/>
-          </w:tcPr>
-          <w:p>
-            <w:r>
-              <w:t>Ch 9</w:t>
-            </w:r>
-          </w:p>
-        </w:tc>
-      </w:tr>
-    </w:tbl>
-    <w:p>
-      <w:r>
-        <w:t>No longer needed (cut from report): S03_swagger_try_chat.png, S04_ui_empty.png, S07_ui_multiturn.png, S12_qa_excel.png, S14_excel_task1.png.</w:t>
-      </w:r>
-    </w:p>
-    <w:p>
-      <w:pPr>
-        <w:pStyle w:val="Heading1"/>
-      </w:pPr>
-      <w:r>
-        <w:t>B) Diagrams — draw / export as PNG (12 required)</w:t>
-      </w:r>
-    </w:p>
-    <w:tbl>
-      <w:tblPr>
-        <w:tblStyle w:val="TableGrid"/>
-        <w:tblW w:type="auto" w:w="0"/>
-        <w:tblLook w:firstColumn="1" w:firstRow="1" w:lastColumn="0" w:lastRow="0" w:noHBand="0" w:noVBand="1" w:val="04A0"/>
-      </w:tblPr>
-      <w:tblGrid>
-        <w:gridCol w:w="2880"/>
-        <w:gridCol w:w="2880"/>
-        <w:gridCol w:w="2880"/>
-      </w:tblGrid>
-      <w:tr>
-        <w:tc>
-          <w:tcPr>
-            <w:tcW w:type="dxa" w:w="2880"/>
-          </w:tcPr>
-          <w:p>
-            <w:r>
-              <w:t>Exact filename</w:t>
-            </w:r>
-          </w:p>
-        </w:tc>
-        <w:tc>
-          <w:tcPr>
-            <w:tcW w:type="dxa" w:w="2880"/>
-          </w:tcPr>
-          <w:p>
-            <w:r>
-              <w:t>Used in</w:t>
-            </w:r>
-          </w:p>
-        </w:tc>
-        <w:tc>
-          <w:tcPr>
-            <w:tcW w:type="dxa" w:w="2880"/>
-          </w:tcPr>
-          <w:p>
-            <w:r>
-              <w:t>What it should show</w:t>
-            </w:r>
-          </w:p>
-        </w:tc>
-      </w:tr>
-      <w:tr>
-        <w:tc>
-          <w:tcPr>
-            <w:tcW w:type="dxa" w:w="2880"/>
+            <w:tcW w:type="dxa" w:w="4320"/>
           </w:tcPr>
           <w:p>
             <w:r>
@@ -764,21 +347,11 @@
         </w:tc>
         <w:tc>
           <w:tcPr>
-            <w:tcW w:type="dxa" w:w="2880"/>
+            <w:tcW w:type="dxa" w:w="4320"/>
           </w:tcPr>
           <w:p>
             <w:r>
-              <w:t>Ch 4</w:t>
-            </w:r>
-          </w:p>
-        </w:tc>
-        <w:tc>
-          <w:tcPr>
-            <w:tcW w:type="dxa" w:w="2880"/>
-          </w:tcPr>
-          <w:p>
-            <w:r>
-              <w:t>Layered tech stack (Client, FastAPI, Neo4j, Redis, LLM, DistilRoBERTa, Compose)</w:t>
+              <w:t>Client → FastAPI → Neo4j/Redis/Mood/LLM/Compose</w:t>
             </w:r>
           </w:p>
         </w:tc>
@@ -786,7 +359,7 @@
       <w:tr>
         <w:tc>
           <w:tcPr>
-            <w:tcW w:type="dxa" w:w="2880"/>
+            <w:tcW w:type="dxa" w:w="4320"/>
           </w:tcPr>
           <w:p>
             <w:r>
@@ -796,21 +369,11 @@
         </w:tc>
         <w:tc>
           <w:tcPr>
-            <w:tcW w:type="dxa" w:w="2880"/>
+            <w:tcW w:type="dxa" w:w="4320"/>
           </w:tcPr>
           <w:p>
             <w:r>
-              <w:t>Ch 4</w:t>
-            </w:r>
-          </w:p>
-        </w:tc>
-        <w:tc>
-          <w:tcPr>
-            <w:tcW w:type="dxa" w:w="2880"/>
-          </w:tcPr>
-          <w:p>
-            <w:r>
-              <w:t>Logical components (Client, FastAPI, Neo4j, Redis, Mood, LLM)</w:t>
+              <w:t>Client, FastAPI, Neo4j, Redis, Mood, LLM</w:t>
             </w:r>
           </w:p>
         </w:tc>
@@ -818,7 +381,7 @@
       <w:tr>
         <w:tc>
           <w:tcPr>
-            <w:tcW w:type="dxa" w:w="2880"/>
+            <w:tcW w:type="dxa" w:w="4320"/>
           </w:tcPr>
           <w:p>
             <w:r>
@@ -828,21 +391,11 @@
         </w:tc>
         <w:tc>
           <w:tcPr>
-            <w:tcW w:type="dxa" w:w="2880"/>
+            <w:tcW w:type="dxa" w:w="4320"/>
           </w:tcPr>
           <w:p>
             <w:r>
-              <w:t>Ch 4</w:t>
-            </w:r>
-          </w:p>
-        </w:tc>
-        <w:tc>
-          <w:tcPr>
-            <w:tcW w:type="dxa" w:w="2880"/>
-          </w:tcPr>
-          <w:p>
-            <w:r>
-              <w:t>As-built POST /chat sequence</w:t>
+              <w:t>One POST /chat turn sequence</w:t>
             </w:r>
           </w:p>
         </w:tc>
@@ -850,7 +403,7 @@
       <w:tr>
         <w:tc>
           <w:tcPr>
-            <w:tcW w:type="dxa" w:w="2880"/>
+            <w:tcW w:type="dxa" w:w="4320"/>
           </w:tcPr>
           <w:p>
             <w:r>
@@ -860,21 +413,11 @@
         </w:tc>
         <w:tc>
           <w:tcPr>
-            <w:tcW w:type="dxa" w:w="2880"/>
+            <w:tcW w:type="dxa" w:w="4320"/>
           </w:tcPr>
           <w:p>
             <w:r>
-              <w:t>Ch 4</w:t>
-            </w:r>
-          </w:p>
-        </w:tc>
-        <w:tc>
-          <w:tcPr>
-            <w:tcW w:type="dxa" w:w="2880"/>
-          </w:tcPr>
-          <w:p>
-            <w:r>
-              <w:t>Ingest JSON → Neo4j</w:t>
+              <w:t>JSON → ingest → Neo4j</w:t>
             </w:r>
           </w:p>
         </w:tc>
@@ -882,7 +425,7 @@
       <w:tr>
         <w:tc>
           <w:tcPr>
-            <w:tcW w:type="dxa" w:w="2880"/>
+            <w:tcW w:type="dxa" w:w="4320"/>
           </w:tcPr>
           <w:p>
             <w:r>
@@ -892,21 +435,11 @@
         </w:tc>
         <w:tc>
           <w:tcPr>
-            <w:tcW w:type="dxa" w:w="2880"/>
+            <w:tcW w:type="dxa" w:w="4320"/>
           </w:tcPr>
           <w:p>
             <w:r>
-              <w:t>Ch 5</w:t>
-            </w:r>
-          </w:p>
-        </w:tc>
-        <w:tc>
-          <w:tcPr>
-            <w:tcW w:type="dxa" w:w="2880"/>
-          </w:tcPr>
-          <w:p>
-            <w:r>
-              <w:t>Neo4j nodes/relationships</w:t>
+              <w:t>User→Portfolio→Sector/Holding→Stock (+MoodEvent)</w:t>
             </w:r>
           </w:p>
         </w:tc>
@@ -914,7 +447,7 @@
       <w:tr>
         <w:tc>
           <w:tcPr>
-            <w:tcW w:type="dxa" w:w="2880"/>
+            <w:tcW w:type="dxa" w:w="4320"/>
           </w:tcPr>
           <w:p>
             <w:r>
@@ -924,21 +457,11 @@
         </w:tc>
         <w:tc>
           <w:tcPr>
-            <w:tcW w:type="dxa" w:w="2880"/>
+            <w:tcW w:type="dxa" w:w="4320"/>
           </w:tcPr>
           <w:p>
             <w:r>
-              <w:t>Ch 5</w:t>
-            </w:r>
-          </w:p>
-        </w:tc>
-        <w:tc>
-          <w:tcPr>
-            <w:tcW w:type="dxa" w:w="2880"/>
-          </w:tcPr>
-          <w:p>
-            <w:r>
-              <w:t>Redis vs Neo4j dual memory</w:t>
+              <w:t>Redis short-term vs Neo4j long-term</w:t>
             </w:r>
           </w:p>
         </w:tc>
@@ -946,7 +469,7 @@
       <w:tr>
         <w:tc>
           <w:tcPr>
-            <w:tcW w:type="dxa" w:w="2880"/>
+            <w:tcW w:type="dxa" w:w="4320"/>
           </w:tcPr>
           <w:p>
             <w:r>
@@ -956,21 +479,11 @@
         </w:tc>
         <w:tc>
           <w:tcPr>
-            <w:tcW w:type="dxa" w:w="2880"/>
+            <w:tcW w:type="dxa" w:w="4320"/>
           </w:tcPr>
           <w:p>
             <w:r>
-              <w:t>Ch 5</w:t>
-            </w:r>
-          </w:p>
-        </w:tc>
-        <w:tc>
-          <w:tcPr>
-            <w:tcW w:type="dxa" w:w="2880"/>
-          </w:tcPr>
-          <w:p>
-            <w:r>
-              <w:t>Intent → retrieve → cite → generate → guardrails</w:t>
+              <w:t>Intent→Cypher→cite→generate→guardrails</w:t>
             </w:r>
           </w:p>
         </w:tc>
@@ -978,7 +491,7 @@
       <w:tr>
         <w:tc>
           <w:tcPr>
-            <w:tcW w:type="dxa" w:w="2880"/>
+            <w:tcW w:type="dxa" w:w="4320"/>
           </w:tcPr>
           <w:p>
             <w:r>
@@ -988,21 +501,11 @@
         </w:tc>
         <w:tc>
           <w:tcPr>
-            <w:tcW w:type="dxa" w:w="2880"/>
+            <w:tcW w:type="dxa" w:w="4320"/>
           </w:tcPr>
           <w:p>
             <w:r>
-              <w:t>Ch 5</w:t>
-            </w:r>
-          </w:p>
-        </w:tc>
-        <w:tc>
-          <w:tcPr>
-            <w:tcW w:type="dxa" w:w="2880"/>
-          </w:tcPr>
-          <w:p>
-            <w:r>
-              <w:t>Guardrails / refuse flow</w:t>
+              <w:t>Empty/advice/ungrounded → refuse</w:t>
             </w:r>
           </w:p>
         </w:tc>
@@ -1010,7 +513,7 @@
       <w:tr>
         <w:tc>
           <w:tcPr>
-            <w:tcW w:type="dxa" w:w="2880"/>
+            <w:tcW w:type="dxa" w:w="4320"/>
           </w:tcPr>
           <w:p>
             <w:r>
@@ -1020,21 +523,11 @@
         </w:tc>
         <w:tc>
           <w:tcPr>
-            <w:tcW w:type="dxa" w:w="2880"/>
+            <w:tcW w:type="dxa" w:w="4320"/>
           </w:tcPr>
           <w:p>
             <w:r>
-              <w:t>Ch 6</w:t>
-            </w:r>
-          </w:p>
-        </w:tc>
-        <w:tc>
-          <w:tcPr>
-            <w:tcW w:type="dxa" w:w="2880"/>
-          </w:tcPr>
-          <w:p>
-            <w:r>
-              <w:t>Backend module collaboration around chat.py</w:t>
+              <w:t>chat.py + services</w:t>
             </w:r>
           </w:p>
         </w:tc>
@@ -1042,7 +535,7 @@
       <w:tr>
         <w:tc>
           <w:tcPr>
-            <w:tcW w:type="dxa" w:w="2880"/>
+            <w:tcW w:type="dxa" w:w="4320"/>
           </w:tcPr>
           <w:p>
             <w:r>
@@ -1052,21 +545,11 @@
         </w:tc>
         <w:tc>
           <w:tcPr>
-            <w:tcW w:type="dxa" w:w="2880"/>
+            <w:tcW w:type="dxa" w:w="4320"/>
           </w:tcPr>
           <w:p>
             <w:r>
-              <w:t>Ch 6</w:t>
-            </w:r>
-          </w:p>
-        </w:tc>
-        <w:tc>
-          <w:tcPr>
-            <w:tcW w:type="dxa" w:w="2880"/>
-          </w:tcPr>
-          <w:p>
-            <w:r>
-              <w:t>/chat request/response anatomy</w:t>
+              <w:t>/chat request + response fields</w:t>
             </w:r>
           </w:p>
         </w:tc>
@@ -1074,7 +557,7 @@
       <w:tr>
         <w:tc>
           <w:tcPr>
-            <w:tcW w:type="dxa" w:w="2880"/>
+            <w:tcW w:type="dxa" w:w="4320"/>
           </w:tcPr>
           <w:p>
             <w:r>
@@ -1084,21 +567,11 @@
         </w:tc>
         <w:tc>
           <w:tcPr>
-            <w:tcW w:type="dxa" w:w="2880"/>
+            <w:tcW w:type="dxa" w:w="4320"/>
           </w:tcPr>
           <w:p>
             <w:r>
-              <w:t>Ch 7</w:t>
-            </w:r>
-          </w:p>
-        </w:tc>
-        <w:tc>
-          <w:tcPr>
-            <w:tcW w:type="dxa" w:w="2880"/>
-          </w:tcPr>
-          <w:p>
-            <w:r>
-              <w:t>Feature map F01–F12</w:t>
+              <w:t>F01–F12 grid</w:t>
             </w:r>
           </w:p>
         </w:tc>
@@ -1106,7 +579,7 @@
       <w:tr>
         <w:tc>
           <w:tcPr>
-            <w:tcW w:type="dxa" w:w="2880"/>
+            <w:tcW w:type="dxa" w:w="4320"/>
           </w:tcPr>
           <w:p>
             <w:r>
@@ -1116,21 +589,11 @@
         </w:tc>
         <w:tc>
           <w:tcPr>
-            <w:tcW w:type="dxa" w:w="2880"/>
+            <w:tcW w:type="dxa" w:w="4320"/>
           </w:tcPr>
           <w:p>
             <w:r>
-              <w:t>Ch 8</w:t>
-            </w:r>
-          </w:p>
-        </w:tc>
-        <w:tc>
-          <w:tcPr>
-            <w:tcW w:type="dxa" w:w="2880"/>
-          </w:tcPr>
-          <w:p>
-            <w:r>
-              <w:t>Test strategy layers (unit / verify / manual)</w:t>
+              <w:t>Unit / verify / manual</w:t>
             </w:r>
           </w:p>
         </w:tc>
@@ -1138,30 +601,12 @@
     </w:tbl>
     <w:p>
       <w:r>
-        <w:t>No longer needed (cut from report): all fig_01_* … fig_07_*, plus fig_10_json_mapping, fig_11_graphrag_vs_vector, fig_12_mood_pipeline, fig_13_j1_ingest, fig_13_j2_chat.</w:t>
-      </w:r>
-    </w:p>
-    <w:p>
-      <w:pPr>
-        <w:pStyle w:val="Heading1"/>
-      </w:pPr>
-      <w:r>
-        <w:t>Notes</w:t>
+        <w:t>Do NOT make: S04, S07, S12, S14, Swagger try-it, or old fig_01…fig_07 / json_mapping / mood_pipeline / J1–J2 charts.</w:t>
       </w:r>
     </w:p>
     <w:p>
       <w:r>
-        <w:t>The same screenshot can be reused in multiple chapters — one file with that name is enough.</w:t>
-      </w:r>
-    </w:p>
-    <w:p>
-      <w:r>
-        <w:t>Canonical checklist also lives in latex/images/README.md.</w:t>
-      </w:r>
-    </w:p>
-    <w:p>
-      <w:r>
-        <w:t>Thank you for helping with these.</w:t>
+        <w:t>Thanks!</w:t>
       </w:r>
     </w:p>
     <w:sectPr>

</xml_diff>